<commit_message>
CLAUDE.md: May 2026 geomcorr closeout appendix + updated priorities
</commit_message>
<xml_diff>
--- a/docs/Helios_1D_Coupling_Correction_Memo.docx
+++ b/docs/Helios_1D_Coupling_Correction_Memo.docx
@@ -87,7 +87,7 @@
           <w:sz w:val="22"/>
           <w:szCs w:val="22"/>
         </w:rPr>
-        <w:t xml:space="preserve">Helios is a 1D spherical hydrodynamics code with a laser ray-trace that models the beam as a single cone of half-angle θ from a fixed focal point at distance d from the target centre. By spherical-symmetry construction, this cone always intercepts the spherical target — Helios cannot reproduce the geometric coupling reduction that occurs in polar-direct-drive (PDD) and hot-spot direct-drive (HDD) configurations, where fixed-pointing beams increasingly miss the imploding capsule as it shrinks. Three-dimensional codes (HYDRA, LILAC, Xrage) capture this self-consistently.</w:t>
+        <w:t xml:space="preserve">Helios is a 1D spherical hydrodynamics code with a laser ray-trace that models the beam as a single cone of half-angle θ from a fixed focal point at distance d from the target centre.  By spherical-symmetry construction, this cone always intercepts the spherical target — Helios cannot reproduce the geometric coupling reduction that occurs in polar-direct-drive (PDD) and hot-spot direct-drive (HDD) configurations, where fixed-pointing beams increasingly miss the imploding capsule as it shrinks.  Three-dimensional codes (HYDRA, LILAC, Xrage) capture this self-consistently.</w:t>
       </w:r>
     </w:p>
     <w:p>
@@ -104,7 +104,56 @@
           <w:sz w:val="22"/>
           <w:szCs w:val="22"/>
         </w:rPr>
-        <w:t xml:space="preserve">This memo lays out four physically reasonable options for adding the geometric correction, ranging from external pre-processing through code modifications of increasing fidelity. The recommended path is to test the correction empirically (Option 1) using a no-burn run, and if the corrected pulse improves agreement with reference codes, motivate Helios developers to integrate Option 2 or Option 3 as a permanent fix.</w:t>
+        <w:t xml:space="preserve">This memo lays out four physically reasonable options for adding the geometric correction (§3), supplies a Python pre-processor that implements Option 1, and reports the empirical outcome of running that pre-processor — and the Helios round-trip — on validated PDD calibration anchors (§6).</w:t>
+      </w:r>
+    </w:p>
+    <w:p>
+      <w:pPr>
+        <w:spacing w:after="120" w:before="0" w:line="280"/>
+      </w:pPr>
+      <w:r>
+        <w:rPr>
+          <w:b/>
+          <w:bCs/>
+          <w:i w:val="false"/>
+          <w:iCs w:val="false"/>
+          <w:sz w:val="22"/>
+          <w:szCs w:val="22"/>
+        </w:rPr>
+        <w:t xml:space="preserve">Outcome. </w:t>
+      </w:r>
+      <w:r>
+        <w:rPr>
+          <w:b w:val="false"/>
+          <w:bCs w:val="false"/>
+          <w:i w:val="false"/>
+          <w:iCs w:val="false"/>
+          <w:sz w:val="22"/>
+          <w:szCs w:val="22"/>
+        </w:rPr>
+        <w:t xml:space="preserve">The pre-processor predicts a −3.7 % integrated correction for the narrow-cone PDD_20_s016 anchor and −14.9 % for the wide-cone PDD_35_s016 anchor, with f_geom = 1.000 at peak laser power in both cases.  Patching the corrected pulse table back into the PDD_35_s016 rhw and re-running Helios delivers −12.3 % less energy (matching the prediction within Helios's spot-coupling second-order shift) and brings on-target laser energy onto the cluster reference value of 1.40 MJ.  Despite this, the binding calibration residuals — adiabat shortfall, ρR_cf shortfall, imploded-mass shortfall, yield gap — survive the correction unchanged or move in the wrong direction.  For HDD lrm4 with its 1° cone, the miss threshold falls to 38 µm and the correction is essentially zero by geometric argument.  </w:t>
+      </w:r>
+      <w:r>
+        <w:rPr>
+          <w:b/>
+          <w:bCs/>
+          <w:i w:val="false"/>
+          <w:iCs w:val="false"/>
+          <w:sz w:val="22"/>
+          <w:szCs w:val="22"/>
+        </w:rPr>
+        <w:t xml:space="preserve">On this basis, Options 2 and 3 (in-Helios source-code modifications) are not pursued.</w:t>
+      </w:r>
+      <w:r>
+        <w:rPr>
+          <w:b w:val="false"/>
+          <w:bCs w:val="false"/>
+          <w:i w:val="false"/>
+          <w:iCs w:val="false"/>
+          <w:sz w:val="22"/>
+          <w:szCs w:val="22"/>
+        </w:rPr>
+        <w:t xml:space="preserve">  The pre-processor and rhw-patcher pipeline is retained as an end-to-end diagnostic for future targets where the geometric miss could be larger — wider cones, shorter focal distances, or more aggressive implosions.</w:t>
       </w:r>
     </w:p>
     <w:p>
@@ -1814,6 +1863,22 @@
     </w:p>
     <w:p>
       <w:pPr>
+        <w:pStyle w:val="Heading2"/>
+        <w:spacing w:after="120" w:before="220"/>
+      </w:pPr>
+      <w:r>
+        <w:rPr>
+          <w:b/>
+          <w:bCs/>
+          <w:color w:val="1A2841"/>
+          <w:sz w:val="24"/>
+          <w:szCs w:val="24"/>
+        </w:rPr>
+        <w:t xml:space="preserve">6.1 PDD_20_s016 (narrow-cone anchor) — pre-processor only</w:t>
+      </w:r>
+    </w:p>
+    <w:p>
+      <w:pPr>
         <w:spacing w:after="120" w:before="0" w:line="280"/>
       </w:pPr>
       <w:r>
@@ -1848,7 +1913,7 @@
           <w:sz w:val="22"/>
           <w:szCs w:val="22"/>
         </w:rPr>
-        <w:t xml:space="preserve">) was run on the validated PDD calibration anchor </w:t>
+        <w:t xml:space="preserve">) was first run on the validated PDD calibration anchor </w:t>
       </w:r>
       <w:r>
         <w:rPr>
@@ -2328,9 +2393,1893 @@
           <w:sz w:val="22"/>
           <w:szCs w:val="22"/>
         </w:rPr>
-        <w:t xml:space="preserve">The geometric-miss threshold for this anchor is R = d·sin(θ) = 753 µm.  At peak power, the ablation front is well above the threshold, so the full cone is captured and no correction applies.  The integrated 3.7 % reduction is concentrated in the late tail of the main pulse, after peak drive has already been delivered.  The implication for the calibration metrics is that peak velocity, foot adiabat, imploded DT mass, and shock-breakout adiabat would all be essentially unchanged by the correction; only late-time coasting kinetic energy and the assembled cold-fuel ρR would see a few-percent reduction.</w:t>
-      </w:r>
-    </w:p>
+        <w:t xml:space="preserve">The geometric-miss threshold for this anchor is R = d·sin(θ) = 753 µm.  At peak power, the ablation front is well above the threshold, so the full cone is captured and no correction applies.  The integrated 3.7 % reduction is concentrated in the late tail of the main pulse, after peak drive has already been delivered.  For HDD lrm4, with cone θ = 1° and the same focal distance, the miss threshold falls to d·sin(1°) = 38 µm — only crossed at deep stagnation, by which point the laser is no longer firing — so the 1D ray-trace miss is essentially zero for the HDD geometry as currently configured.</w:t>
+      </w:r>
+    </w:p>
+    <w:p>
+      <w:pPr>
+        <w:pStyle w:val="Heading2"/>
+        <w:spacing w:after="120" w:before="220"/>
+      </w:pPr>
+      <w:r>
+        <w:rPr>
+          <w:b/>
+          <w:bCs/>
+          <w:color w:val="1A2841"/>
+          <w:sz w:val="24"/>
+          <w:szCs w:val="24"/>
+        </w:rPr>
+        <w:t xml:space="preserve">6.2 PDD_35_s016 (wide-cone anchor) — Helios round-trip test</w:t>
+      </w:r>
+    </w:p>
+    <w:p>
+      <w:pPr>
+        <w:spacing w:after="120" w:before="0" w:line="280"/>
+      </w:pPr>
+      <w:r>
+        <w:rPr>
+          <w:b w:val="false"/>
+          <w:bCs w:val="false"/>
+          <w:i w:val="false"/>
+          <w:iCs w:val="false"/>
+          <w:sz w:val="22"/>
+          <w:szCs w:val="22"/>
+        </w:rPr>
+        <w:t xml:space="preserve">Selecting a wider-cone anchor where the geometric correction is large enough to materially affect the integrated drive, the Option 1 pre-processor was run on </w:t>
+      </w:r>
+      <w:r>
+        <w:rPr>
+          <w:b/>
+          <w:bCs/>
+          <w:i w:val="false"/>
+          <w:iCs w:val="false"/>
+          <w:sz w:val="22"/>
+          <w:szCs w:val="22"/>
+        </w:rPr>
+        <w:t xml:space="preserve">PDD_35_s016</w:t>
+      </w:r>
+      <w:r>
+        <w:rPr>
+          <w:b w:val="false"/>
+          <w:bCs w:val="false"/>
+          <w:i w:val="false"/>
+          <w:iCs w:val="false"/>
+          <w:sz w:val="22"/>
+          <w:szCs w:val="22"/>
+        </w:rPr>
+        <w:t xml:space="preserve"> (cone θ = 35°, miss threshold d·sin(θ) = 1262 µm).  Pre-processor result: f_geom at peak power = 1.000 (t = 10.7 ns), mean f_geom over laser-on = 0.897, integrated ΔE_delivered = −14.9 %.</w:t>
+      </w:r>
+    </w:p>
+    <w:p>
+      <w:pPr>
+        <w:spacing w:after="120" w:before="0" w:line="280"/>
+      </w:pPr>
+      <w:r>
+        <w:rPr>
+          <w:b w:val="false"/>
+          <w:bCs w:val="false"/>
+          <w:i w:val="false"/>
+          <w:iCs w:val="false"/>
+          <w:sz w:val="22"/>
+          <w:szCs w:val="22"/>
+        </w:rPr>
+        <w:t xml:space="preserve">The corrected pulse table was injected back into the rhw (resampled from 6 to 200 control points so the f_geom shape is properly represented under Helios's piecewise-linear interpolation; see </w:t>
+      </w:r>
+      <w:r>
+        <w:rPr>
+          <w:rFonts w:ascii="Consolas" w:cs="Consolas" w:eastAsia="Consolas" w:hAnsi="Consolas"/>
+          <w:b w:val="false"/>
+          <w:bCs w:val="false"/>
+          <w:i w:val="false"/>
+          <w:iCs w:val="false"/>
+          <w:sz w:val="20"/>
+          <w:szCs w:val="20"/>
+        </w:rPr>
+        <w:t xml:space="preserve">apply_geomcorr_to_rhw.py</w:t>
+      </w:r>
+      <w:r>
+        <w:rPr>
+          <w:b w:val="false"/>
+          <w:bCs w:val="false"/>
+          <w:i w:val="false"/>
+          <w:iCs w:val="false"/>
+          <w:sz w:val="22"/>
+          <w:szCs w:val="22"/>
+        </w:rPr>
+        <w:t xml:space="preserve">).  Helios was re-run on the corrected pulse and post-processed identically to the baseline.  Side-by-side metric comparison:</w:t>
+      </w:r>
+    </w:p>
+    <w:tbl>
+      <w:tblPr>
+        <w:tblW w:type="dxa" w:w="9100"/>
+        <w:tblBorders>
+          <w:top w:val="single" w:color="auto" w:sz="4"/>
+          <w:left w:val="single" w:color="auto" w:sz="4"/>
+          <w:bottom w:val="single" w:color="auto" w:sz="4"/>
+          <w:right w:val="single" w:color="auto" w:sz="4"/>
+          <w:insideH w:val="single" w:color="auto" w:sz="4"/>
+          <w:insideV w:val="single" w:color="auto" w:sz="4"/>
+        </w:tblBorders>
+      </w:tblPr>
+      <w:tblGrid>
+        <w:gridCol w:w="3200"/>
+        <w:gridCol w:w="1700"/>
+        <w:gridCol w:w="1700"/>
+        <w:gridCol w:w="1300"/>
+        <w:gridCol w:w="1200"/>
+      </w:tblGrid>
+      <w:tr>
+        <w:trPr>
+          <w:cantSplit/>
+          <w:tblHeader/>
+        </w:trPr>
+        <w:tc>
+          <w:tcPr>
+            <w:tcW w:type="dxa" w:w="3200"/>
+            <w:tcBorders>
+              <w:top w:val="single" w:color="C8CFD6" w:sz="4"/>
+              <w:left w:val="single" w:color="C8CFD6" w:sz="4"/>
+              <w:bottom w:val="single" w:color="C8CFD6" w:sz="4"/>
+              <w:right w:val="single" w:color="C8CFD6" w:sz="4"/>
+            </w:tcBorders>
+            <w:shd w:fill="1A2841" w:val="clear"/>
+            <w:tcMar>
+              <w:top w:type="dxa" w:w="80"/>
+              <w:left w:type="dxa" w:w="120"/>
+              <w:bottom w:type="dxa" w:w="80"/>
+              <w:right w:type="dxa" w:w="120"/>
+            </w:tcMar>
+          </w:tcPr>
+          <w:p>
+            <w:pPr>
+              <w:jc w:val="center"/>
+            </w:pPr>
+            <w:r>
+              <w:rPr>
+                <w:b/>
+                <w:bCs/>
+                <w:color w:val="FFFFFF"/>
+                <w:sz w:val="20"/>
+                <w:szCs w:val="20"/>
+              </w:rPr>
+              <w:t xml:space="preserve">Metric</w:t>
+            </w:r>
+          </w:p>
+        </w:tc>
+        <w:tc>
+          <w:tcPr>
+            <w:tcW w:type="dxa" w:w="1700"/>
+            <w:tcBorders>
+              <w:top w:val="single" w:color="C8CFD6" w:sz="4"/>
+              <w:left w:val="single" w:color="C8CFD6" w:sz="4"/>
+              <w:bottom w:val="single" w:color="C8CFD6" w:sz="4"/>
+              <w:right w:val="single" w:color="C8CFD6" w:sz="4"/>
+            </w:tcBorders>
+            <w:shd w:fill="1A2841" w:val="clear"/>
+            <w:tcMar>
+              <w:top w:type="dxa" w:w="80"/>
+              <w:left w:type="dxa" w:w="120"/>
+              <w:bottom w:type="dxa" w:w="80"/>
+              <w:right w:type="dxa" w:w="120"/>
+            </w:tcMar>
+          </w:tcPr>
+          <w:p>
+            <w:pPr>
+              <w:jc w:val="center"/>
+            </w:pPr>
+            <w:r>
+              <w:rPr>
+                <w:b/>
+                <w:bCs/>
+                <w:color w:val="FFFFFF"/>
+                <w:sz w:val="20"/>
+                <w:szCs w:val="20"/>
+              </w:rPr>
+              <w:t xml:space="preserve">Baseline</w:t>
+            </w:r>
+          </w:p>
+        </w:tc>
+        <w:tc>
+          <w:tcPr>
+            <w:tcW w:type="dxa" w:w="1700"/>
+            <w:tcBorders>
+              <w:top w:val="single" w:color="C8CFD6" w:sz="4"/>
+              <w:left w:val="single" w:color="C8CFD6" w:sz="4"/>
+              <w:bottom w:val="single" w:color="C8CFD6" w:sz="4"/>
+              <w:right w:val="single" w:color="C8CFD6" w:sz="4"/>
+            </w:tcBorders>
+            <w:shd w:fill="1A2841" w:val="clear"/>
+            <w:tcMar>
+              <w:top w:type="dxa" w:w="80"/>
+              <w:left w:type="dxa" w:w="120"/>
+              <w:bottom w:type="dxa" w:w="80"/>
+              <w:right w:type="dxa" w:w="120"/>
+            </w:tcMar>
+          </w:tcPr>
+          <w:p>
+            <w:pPr>
+              <w:jc w:val="center"/>
+            </w:pPr>
+            <w:r>
+              <w:rPr>
+                <w:b/>
+                <w:bCs/>
+                <w:color w:val="FFFFFF"/>
+                <w:sz w:val="20"/>
+                <w:szCs w:val="20"/>
+              </w:rPr>
+              <w:t xml:space="preserve">Corrected</w:t>
+            </w:r>
+          </w:p>
+        </w:tc>
+        <w:tc>
+          <w:tcPr>
+            <w:tcW w:type="dxa" w:w="1300"/>
+            <w:tcBorders>
+              <w:top w:val="single" w:color="C8CFD6" w:sz="4"/>
+              <w:left w:val="single" w:color="C8CFD6" w:sz="4"/>
+              <w:bottom w:val="single" w:color="C8CFD6" w:sz="4"/>
+              <w:right w:val="single" w:color="C8CFD6" w:sz="4"/>
+            </w:tcBorders>
+            <w:shd w:fill="1A2841" w:val="clear"/>
+            <w:tcMar>
+              <w:top w:type="dxa" w:w="80"/>
+              <w:left w:type="dxa" w:w="120"/>
+              <w:bottom w:type="dxa" w:w="80"/>
+              <w:right w:type="dxa" w:w="120"/>
+            </w:tcMar>
+          </w:tcPr>
+          <w:p>
+            <w:pPr>
+              <w:jc w:val="center"/>
+            </w:pPr>
+            <w:r>
+              <w:rPr>
+                <w:b/>
+                <w:bCs/>
+                <w:color w:val="FFFFFF"/>
+                <w:sz w:val="20"/>
+                <w:szCs w:val="20"/>
+              </w:rPr>
+              <w:t xml:space="preserve">Δ</w:t>
+            </w:r>
+          </w:p>
+        </w:tc>
+        <w:tc>
+          <w:tcPr>
+            <w:tcW w:type="dxa" w:w="1200"/>
+            <w:tcBorders>
+              <w:top w:val="single" w:color="C8CFD6" w:sz="4"/>
+              <w:left w:val="single" w:color="C8CFD6" w:sz="4"/>
+              <w:bottom w:val="single" w:color="C8CFD6" w:sz="4"/>
+              <w:right w:val="single" w:color="C8CFD6" w:sz="4"/>
+            </w:tcBorders>
+            <w:shd w:fill="1A2841" w:val="clear"/>
+            <w:tcMar>
+              <w:top w:type="dxa" w:w="80"/>
+              <w:left w:type="dxa" w:w="120"/>
+              <w:bottom w:type="dxa" w:w="80"/>
+              <w:right w:type="dxa" w:w="120"/>
+            </w:tcMar>
+          </w:tcPr>
+          <w:p>
+            <w:pPr>
+              <w:jc w:val="center"/>
+            </w:pPr>
+            <w:r>
+              <w:rPr>
+                <w:b/>
+                <w:bCs/>
+                <w:color w:val="FFFFFF"/>
+                <w:sz w:val="20"/>
+                <w:szCs w:val="20"/>
+              </w:rPr>
+              <w:t xml:space="preserve">Cluster</w:t>
+            </w:r>
+          </w:p>
+        </w:tc>
+      </w:tr>
+      <w:tr>
+        <w:trPr>
+          <w:cantSplit/>
+        </w:trPr>
+        <w:tc>
+          <w:tcPr>
+            <w:tcW w:type="dxa" w:w="3200"/>
+            <w:tcBorders>
+              <w:top w:val="single" w:color="C8CFD6" w:sz="4"/>
+              <w:left w:val="single" w:color="C8CFD6" w:sz="4"/>
+              <w:bottom w:val="single" w:color="C8CFD6" w:sz="4"/>
+              <w:right w:val="single" w:color="C8CFD6" w:sz="4"/>
+            </w:tcBorders>
+            <w:tcMar>
+              <w:top w:type="dxa" w:w="80"/>
+              <w:left w:type="dxa" w:w="120"/>
+              <w:bottom w:type="dxa" w:w="80"/>
+              <w:right w:type="dxa" w:w="120"/>
+            </w:tcMar>
+          </w:tcPr>
+          <w:p>
+            <w:pPr>
+              <w:jc w:val="left"/>
+            </w:pPr>
+            <w:r>
+              <w:rPr>
+                <w:b w:val="false"/>
+                <w:bCs w:val="false"/>
+                <w:sz w:val="20"/>
+                <w:szCs w:val="20"/>
+              </w:rPr>
+              <w:t xml:space="preserve">Laser energy on target (MJ)</w:t>
+            </w:r>
+          </w:p>
+        </w:tc>
+        <w:tc>
+          <w:tcPr>
+            <w:tcW w:type="dxa" w:w="1700"/>
+            <w:tcBorders>
+              <w:top w:val="single" w:color="C8CFD6" w:sz="4"/>
+              <w:left w:val="single" w:color="C8CFD6" w:sz="4"/>
+              <w:bottom w:val="single" w:color="C8CFD6" w:sz="4"/>
+              <w:right w:val="single" w:color="C8CFD6" w:sz="4"/>
+            </w:tcBorders>
+            <w:tcMar>
+              <w:top w:type="dxa" w:w="80"/>
+              <w:left w:type="dxa" w:w="120"/>
+              <w:bottom w:type="dxa" w:w="80"/>
+              <w:right w:type="dxa" w:w="120"/>
+            </w:tcMar>
+          </w:tcPr>
+          <w:p>
+            <w:pPr>
+              <w:jc w:val="center"/>
+            </w:pPr>
+            <w:r>
+              <w:rPr>
+                <w:b w:val="false"/>
+                <w:bCs w:val="false"/>
+                <w:sz w:val="20"/>
+                <w:szCs w:val="20"/>
+              </w:rPr>
+              <w:t xml:space="preserve">1.656</w:t>
+            </w:r>
+          </w:p>
+        </w:tc>
+        <w:tc>
+          <w:tcPr>
+            <w:tcW w:type="dxa" w:w="1700"/>
+            <w:tcBorders>
+              <w:top w:val="single" w:color="C8CFD6" w:sz="4"/>
+              <w:left w:val="single" w:color="C8CFD6" w:sz="4"/>
+              <w:bottom w:val="single" w:color="C8CFD6" w:sz="4"/>
+              <w:right w:val="single" w:color="C8CFD6" w:sz="4"/>
+            </w:tcBorders>
+            <w:tcMar>
+              <w:top w:type="dxa" w:w="80"/>
+              <w:left w:type="dxa" w:w="120"/>
+              <w:bottom w:type="dxa" w:w="80"/>
+              <w:right w:type="dxa" w:w="120"/>
+            </w:tcMar>
+          </w:tcPr>
+          <w:p>
+            <w:pPr>
+              <w:jc w:val="center"/>
+            </w:pPr>
+            <w:r>
+              <w:rPr>
+                <w:b/>
+                <w:bCs/>
+                <w:sz w:val="20"/>
+                <w:szCs w:val="20"/>
+              </w:rPr>
+              <w:t xml:space="preserve">1.452</w:t>
+            </w:r>
+          </w:p>
+        </w:tc>
+        <w:tc>
+          <w:tcPr>
+            <w:tcW w:type="dxa" w:w="1300"/>
+            <w:tcBorders>
+              <w:top w:val="single" w:color="C8CFD6" w:sz="4"/>
+              <w:left w:val="single" w:color="C8CFD6" w:sz="4"/>
+              <w:bottom w:val="single" w:color="C8CFD6" w:sz="4"/>
+              <w:right w:val="single" w:color="C8CFD6" w:sz="4"/>
+            </w:tcBorders>
+            <w:tcMar>
+              <w:top w:type="dxa" w:w="80"/>
+              <w:left w:type="dxa" w:w="120"/>
+              <w:bottom w:type="dxa" w:w="80"/>
+              <w:right w:type="dxa" w:w="120"/>
+            </w:tcMar>
+          </w:tcPr>
+          <w:p>
+            <w:pPr>
+              <w:jc w:val="center"/>
+            </w:pPr>
+            <w:r>
+              <w:rPr>
+                <w:b/>
+                <w:bCs/>
+                <w:sz w:val="20"/>
+                <w:szCs w:val="20"/>
+              </w:rPr>
+              <w:t xml:space="preserve">−12.3 %</w:t>
+            </w:r>
+          </w:p>
+        </w:tc>
+        <w:tc>
+          <w:tcPr>
+            <w:tcW w:type="dxa" w:w="1200"/>
+            <w:tcBorders>
+              <w:top w:val="single" w:color="C8CFD6" w:sz="4"/>
+              <w:left w:val="single" w:color="C8CFD6" w:sz="4"/>
+              <w:bottom w:val="single" w:color="C8CFD6" w:sz="4"/>
+              <w:right w:val="single" w:color="C8CFD6" w:sz="4"/>
+            </w:tcBorders>
+            <w:tcMar>
+              <w:top w:type="dxa" w:w="80"/>
+              <w:left w:type="dxa" w:w="120"/>
+              <w:bottom w:type="dxa" w:w="80"/>
+              <w:right w:type="dxa" w:w="120"/>
+            </w:tcMar>
+          </w:tcPr>
+          <w:p>
+            <w:pPr>
+              <w:jc w:val="center"/>
+            </w:pPr>
+            <w:r>
+              <w:rPr>
+                <w:b w:val="false"/>
+                <w:bCs w:val="false"/>
+                <w:sz w:val="20"/>
+                <w:szCs w:val="20"/>
+              </w:rPr>
+              <w:t xml:space="preserve">1.40</w:t>
+            </w:r>
+          </w:p>
+        </w:tc>
+      </w:tr>
+      <w:tr>
+        <w:trPr>
+          <w:cantSplit/>
+        </w:trPr>
+        <w:tc>
+          <w:tcPr>
+            <w:tcW w:type="dxa" w:w="3200"/>
+            <w:tcBorders>
+              <w:top w:val="single" w:color="C8CFD6" w:sz="4"/>
+              <w:left w:val="single" w:color="C8CFD6" w:sz="4"/>
+              <w:bottom w:val="single" w:color="C8CFD6" w:sz="4"/>
+              <w:right w:val="single" w:color="C8CFD6" w:sz="4"/>
+            </w:tcBorders>
+            <w:tcMar>
+              <w:top w:type="dxa" w:w="80"/>
+              <w:left w:type="dxa" w:w="120"/>
+              <w:bottom w:type="dxa" w:w="80"/>
+              <w:right w:type="dxa" w:w="120"/>
+            </w:tcMar>
+          </w:tcPr>
+          <w:p>
+            <w:pPr>
+              <w:jc w:val="left"/>
+            </w:pPr>
+            <w:r>
+              <w:rPr>
+                <w:b w:val="false"/>
+                <w:bCs w:val="false"/>
+                <w:sz w:val="20"/>
+                <w:szCs w:val="20"/>
+              </w:rPr>
+              <w:t xml:space="preserve">Helios spot–sphere coupling (%)</w:t>
+            </w:r>
+          </w:p>
+        </w:tc>
+        <w:tc>
+          <w:tcPr>
+            <w:tcW w:type="dxa" w:w="1700"/>
+            <w:tcBorders>
+              <w:top w:val="single" w:color="C8CFD6" w:sz="4"/>
+              <w:left w:val="single" w:color="C8CFD6" w:sz="4"/>
+              <w:bottom w:val="single" w:color="C8CFD6" w:sz="4"/>
+              <w:right w:val="single" w:color="C8CFD6" w:sz="4"/>
+            </w:tcBorders>
+            <w:tcMar>
+              <w:top w:type="dxa" w:w="80"/>
+              <w:left w:type="dxa" w:w="120"/>
+              <w:bottom w:type="dxa" w:w="80"/>
+              <w:right w:type="dxa" w:w="120"/>
+            </w:tcMar>
+          </w:tcPr>
+          <w:p>
+            <w:pPr>
+              <w:jc w:val="center"/>
+            </w:pPr>
+            <w:r>
+              <w:rPr>
+                <w:b w:val="false"/>
+                <w:bCs w:val="false"/>
+                <w:sz w:val="20"/>
+                <w:szCs w:val="20"/>
+              </w:rPr>
+              <w:t xml:space="preserve">79.6</w:t>
+            </w:r>
+          </w:p>
+        </w:tc>
+        <w:tc>
+          <w:tcPr>
+            <w:tcW w:type="dxa" w:w="1700"/>
+            <w:tcBorders>
+              <w:top w:val="single" w:color="C8CFD6" w:sz="4"/>
+              <w:left w:val="single" w:color="C8CFD6" w:sz="4"/>
+              <w:bottom w:val="single" w:color="C8CFD6" w:sz="4"/>
+              <w:right w:val="single" w:color="C8CFD6" w:sz="4"/>
+            </w:tcBorders>
+            <w:tcMar>
+              <w:top w:type="dxa" w:w="80"/>
+              <w:left w:type="dxa" w:w="120"/>
+              <w:bottom w:type="dxa" w:w="80"/>
+              <w:right w:type="dxa" w:w="120"/>
+            </w:tcMar>
+          </w:tcPr>
+          <w:p>
+            <w:pPr>
+              <w:jc w:val="center"/>
+            </w:pPr>
+            <w:r>
+              <w:rPr>
+                <w:b w:val="false"/>
+                <w:bCs w:val="false"/>
+                <w:sz w:val="20"/>
+                <w:szCs w:val="20"/>
+              </w:rPr>
+              <w:t xml:space="preserve">82.0</w:t>
+            </w:r>
+          </w:p>
+        </w:tc>
+        <w:tc>
+          <w:tcPr>
+            <w:tcW w:type="dxa" w:w="1300"/>
+            <w:tcBorders>
+              <w:top w:val="single" w:color="C8CFD6" w:sz="4"/>
+              <w:left w:val="single" w:color="C8CFD6" w:sz="4"/>
+              <w:bottom w:val="single" w:color="C8CFD6" w:sz="4"/>
+              <w:right w:val="single" w:color="C8CFD6" w:sz="4"/>
+            </w:tcBorders>
+            <w:tcMar>
+              <w:top w:type="dxa" w:w="80"/>
+              <w:left w:type="dxa" w:w="120"/>
+              <w:bottom w:type="dxa" w:w="80"/>
+              <w:right w:type="dxa" w:w="120"/>
+            </w:tcMar>
+          </w:tcPr>
+          <w:p>
+            <w:pPr>
+              <w:jc w:val="center"/>
+            </w:pPr>
+            <w:r>
+              <w:rPr>
+                <w:b w:val="false"/>
+                <w:bCs w:val="false"/>
+                <w:sz w:val="20"/>
+                <w:szCs w:val="20"/>
+              </w:rPr>
+              <w:t xml:space="preserve">+2.4 pp</w:t>
+            </w:r>
+          </w:p>
+        </w:tc>
+        <w:tc>
+          <w:tcPr>
+            <w:tcW w:type="dxa" w:w="1200"/>
+            <w:tcBorders>
+              <w:top w:val="single" w:color="C8CFD6" w:sz="4"/>
+              <w:left w:val="single" w:color="C8CFD6" w:sz="4"/>
+              <w:bottom w:val="single" w:color="C8CFD6" w:sz="4"/>
+              <w:right w:val="single" w:color="C8CFD6" w:sz="4"/>
+            </w:tcBorders>
+            <w:tcMar>
+              <w:top w:type="dxa" w:w="80"/>
+              <w:left w:type="dxa" w:w="120"/>
+              <w:bottom w:type="dxa" w:w="80"/>
+              <w:right w:type="dxa" w:w="120"/>
+            </w:tcMar>
+          </w:tcPr>
+          <w:p>
+            <w:pPr>
+              <w:jc w:val="center"/>
+            </w:pPr>
+            <w:r>
+              <w:rPr>
+                <w:b w:val="false"/>
+                <w:bCs w:val="false"/>
+                <w:sz w:val="20"/>
+                <w:szCs w:val="20"/>
+              </w:rPr>
+              <w:t xml:space="preserve">65 ± 9</w:t>
+            </w:r>
+          </w:p>
+        </w:tc>
+      </w:tr>
+      <w:tr>
+        <w:trPr>
+          <w:cantSplit/>
+        </w:trPr>
+        <w:tc>
+          <w:tcPr>
+            <w:tcW w:type="dxa" w:w="3200"/>
+            <w:tcBorders>
+              <w:top w:val="single" w:color="C8CFD6" w:sz="4"/>
+              <w:left w:val="single" w:color="C8CFD6" w:sz="4"/>
+              <w:bottom w:val="single" w:color="C8CFD6" w:sz="4"/>
+              <w:right w:val="single" w:color="C8CFD6" w:sz="4"/>
+            </w:tcBorders>
+            <w:tcMar>
+              <w:top w:type="dxa" w:w="80"/>
+              <w:left w:type="dxa" w:w="120"/>
+              <w:bottom w:type="dxa" w:w="80"/>
+              <w:right w:type="dxa" w:w="120"/>
+            </w:tcMar>
+          </w:tcPr>
+          <w:p>
+            <w:pPr>
+              <w:jc w:val="left"/>
+            </w:pPr>
+            <w:r>
+              <w:rPr>
+                <w:b w:val="false"/>
+                <w:bCs w:val="false"/>
+                <w:sz w:val="20"/>
+                <w:szCs w:val="20"/>
+              </w:rPr>
+              <w:t xml:space="preserve">Peak velocity (km/s)</w:t>
+            </w:r>
+          </w:p>
+        </w:tc>
+        <w:tc>
+          <w:tcPr>
+            <w:tcW w:type="dxa" w:w="1700"/>
+            <w:tcBorders>
+              <w:top w:val="single" w:color="C8CFD6" w:sz="4"/>
+              <w:left w:val="single" w:color="C8CFD6" w:sz="4"/>
+              <w:bottom w:val="single" w:color="C8CFD6" w:sz="4"/>
+              <w:right w:val="single" w:color="C8CFD6" w:sz="4"/>
+            </w:tcBorders>
+            <w:tcMar>
+              <w:top w:type="dxa" w:w="80"/>
+              <w:left w:type="dxa" w:w="120"/>
+              <w:bottom w:type="dxa" w:w="80"/>
+              <w:right w:type="dxa" w:w="120"/>
+            </w:tcMar>
+          </w:tcPr>
+          <w:p>
+            <w:pPr>
+              <w:jc w:val="center"/>
+            </w:pPr>
+            <w:r>
+              <w:rPr>
+                <w:b w:val="false"/>
+                <w:bCs w:val="false"/>
+                <w:sz w:val="20"/>
+                <w:szCs w:val="20"/>
+              </w:rPr>
+              <w:t xml:space="preserve">450.6</w:t>
+            </w:r>
+          </w:p>
+        </w:tc>
+        <w:tc>
+          <w:tcPr>
+            <w:tcW w:type="dxa" w:w="1700"/>
+            <w:tcBorders>
+              <w:top w:val="single" w:color="C8CFD6" w:sz="4"/>
+              <w:left w:val="single" w:color="C8CFD6" w:sz="4"/>
+              <w:bottom w:val="single" w:color="C8CFD6" w:sz="4"/>
+              <w:right w:val="single" w:color="C8CFD6" w:sz="4"/>
+            </w:tcBorders>
+            <w:tcMar>
+              <w:top w:type="dxa" w:w="80"/>
+              <w:left w:type="dxa" w:w="120"/>
+              <w:bottom w:type="dxa" w:w="80"/>
+              <w:right w:type="dxa" w:w="120"/>
+            </w:tcMar>
+          </w:tcPr>
+          <w:p>
+            <w:pPr>
+              <w:jc w:val="center"/>
+            </w:pPr>
+            <w:r>
+              <w:rPr>
+                <w:b w:val="false"/>
+                <w:bCs w:val="false"/>
+                <w:sz w:val="20"/>
+                <w:szCs w:val="20"/>
+              </w:rPr>
+              <w:t xml:space="preserve">443.3</w:t>
+            </w:r>
+          </w:p>
+        </w:tc>
+        <w:tc>
+          <w:tcPr>
+            <w:tcW w:type="dxa" w:w="1300"/>
+            <w:tcBorders>
+              <w:top w:val="single" w:color="C8CFD6" w:sz="4"/>
+              <w:left w:val="single" w:color="C8CFD6" w:sz="4"/>
+              <w:bottom w:val="single" w:color="C8CFD6" w:sz="4"/>
+              <w:right w:val="single" w:color="C8CFD6" w:sz="4"/>
+            </w:tcBorders>
+            <w:tcMar>
+              <w:top w:type="dxa" w:w="80"/>
+              <w:left w:type="dxa" w:w="120"/>
+              <w:bottom w:type="dxa" w:w="80"/>
+              <w:right w:type="dxa" w:w="120"/>
+            </w:tcMar>
+          </w:tcPr>
+          <w:p>
+            <w:pPr>
+              <w:jc w:val="center"/>
+            </w:pPr>
+            <w:r>
+              <w:rPr>
+                <w:b w:val="false"/>
+                <w:bCs w:val="false"/>
+                <w:sz w:val="20"/>
+                <w:szCs w:val="20"/>
+              </w:rPr>
+              <w:t xml:space="preserve">−1.6 %</w:t>
+            </w:r>
+          </w:p>
+        </w:tc>
+        <w:tc>
+          <w:tcPr>
+            <w:tcW w:type="dxa" w:w="1200"/>
+            <w:tcBorders>
+              <w:top w:val="single" w:color="C8CFD6" w:sz="4"/>
+              <w:left w:val="single" w:color="C8CFD6" w:sz="4"/>
+              <w:bottom w:val="single" w:color="C8CFD6" w:sz="4"/>
+              <w:right w:val="single" w:color="C8CFD6" w:sz="4"/>
+            </w:tcBorders>
+            <w:tcMar>
+              <w:top w:type="dxa" w:w="80"/>
+              <w:left w:type="dxa" w:w="120"/>
+              <w:bottom w:type="dxa" w:w="80"/>
+              <w:right w:type="dxa" w:w="120"/>
+            </w:tcMar>
+          </w:tcPr>
+          <w:p>
+            <w:pPr>
+              <w:jc w:val="center"/>
+            </w:pPr>
+            <w:r>
+              <w:rPr>
+                <w:b w:val="false"/>
+                <w:bCs w:val="false"/>
+                <w:sz w:val="20"/>
+                <w:szCs w:val="20"/>
+              </w:rPr>
+              <w:t xml:space="preserve">470</w:t>
+            </w:r>
+          </w:p>
+        </w:tc>
+      </w:tr>
+      <w:tr>
+        <w:trPr>
+          <w:cantSplit/>
+        </w:trPr>
+        <w:tc>
+          <w:tcPr>
+            <w:tcW w:type="dxa" w:w="3200"/>
+            <w:tcBorders>
+              <w:top w:val="single" w:color="C8CFD6" w:sz="4"/>
+              <w:left w:val="single" w:color="C8CFD6" w:sz="4"/>
+              <w:bottom w:val="single" w:color="C8CFD6" w:sz="4"/>
+              <w:right w:val="single" w:color="C8CFD6" w:sz="4"/>
+            </w:tcBorders>
+            <w:tcMar>
+              <w:top w:type="dxa" w:w="80"/>
+              <w:left w:type="dxa" w:w="120"/>
+              <w:bottom w:type="dxa" w:w="80"/>
+              <w:right w:type="dxa" w:w="120"/>
+            </w:tcMar>
+          </w:tcPr>
+          <w:p>
+            <w:pPr>
+              <w:jc w:val="left"/>
+            </w:pPr>
+            <w:r>
+              <w:rPr>
+                <w:b w:val="false"/>
+                <w:bCs w:val="false"/>
+                <w:sz w:val="20"/>
+                <w:szCs w:val="20"/>
+              </w:rPr>
+              <w:t xml:space="preserve">Adiabat (mass-avg, peak v)</w:t>
+            </w:r>
+          </w:p>
+        </w:tc>
+        <w:tc>
+          <w:tcPr>
+            <w:tcW w:type="dxa" w:w="1700"/>
+            <w:tcBorders>
+              <w:top w:val="single" w:color="C8CFD6" w:sz="4"/>
+              <w:left w:val="single" w:color="C8CFD6" w:sz="4"/>
+              <w:bottom w:val="single" w:color="C8CFD6" w:sz="4"/>
+              <w:right w:val="single" w:color="C8CFD6" w:sz="4"/>
+            </w:tcBorders>
+            <w:tcMar>
+              <w:top w:type="dxa" w:w="80"/>
+              <w:left w:type="dxa" w:w="120"/>
+              <w:bottom w:type="dxa" w:w="80"/>
+              <w:right w:type="dxa" w:w="120"/>
+            </w:tcMar>
+          </w:tcPr>
+          <w:p>
+            <w:pPr>
+              <w:jc w:val="center"/>
+            </w:pPr>
+            <w:r>
+              <w:rPr>
+                <w:b w:val="false"/>
+                <w:bCs w:val="false"/>
+                <w:sz w:val="20"/>
+                <w:szCs w:val="20"/>
+              </w:rPr>
+              <w:t xml:space="preserve">1.79</w:t>
+            </w:r>
+          </w:p>
+        </w:tc>
+        <w:tc>
+          <w:tcPr>
+            <w:tcW w:type="dxa" w:w="1700"/>
+            <w:tcBorders>
+              <w:top w:val="single" w:color="C8CFD6" w:sz="4"/>
+              <w:left w:val="single" w:color="C8CFD6" w:sz="4"/>
+              <w:bottom w:val="single" w:color="C8CFD6" w:sz="4"/>
+              <w:right w:val="single" w:color="C8CFD6" w:sz="4"/>
+            </w:tcBorders>
+            <w:tcMar>
+              <w:top w:type="dxa" w:w="80"/>
+              <w:left w:type="dxa" w:w="120"/>
+              <w:bottom w:type="dxa" w:w="80"/>
+              <w:right w:type="dxa" w:w="120"/>
+            </w:tcMar>
+          </w:tcPr>
+          <w:p>
+            <w:pPr>
+              <w:jc w:val="center"/>
+            </w:pPr>
+            <w:r>
+              <w:rPr>
+                <w:b w:val="false"/>
+                <w:bCs w:val="false"/>
+                <w:sz w:val="20"/>
+                <w:szCs w:val="20"/>
+              </w:rPr>
+              <w:t xml:space="preserve">1.07</w:t>
+            </w:r>
+          </w:p>
+        </w:tc>
+        <w:tc>
+          <w:tcPr>
+            <w:tcW w:type="dxa" w:w="1300"/>
+            <w:tcBorders>
+              <w:top w:val="single" w:color="C8CFD6" w:sz="4"/>
+              <w:left w:val="single" w:color="C8CFD6" w:sz="4"/>
+              <w:bottom w:val="single" w:color="C8CFD6" w:sz="4"/>
+              <w:right w:val="single" w:color="C8CFD6" w:sz="4"/>
+            </w:tcBorders>
+            <w:tcMar>
+              <w:top w:type="dxa" w:w="80"/>
+              <w:left w:type="dxa" w:w="120"/>
+              <w:bottom w:type="dxa" w:w="80"/>
+              <w:right w:type="dxa" w:w="120"/>
+            </w:tcMar>
+          </w:tcPr>
+          <w:p>
+            <w:pPr>
+              <w:jc w:val="center"/>
+            </w:pPr>
+            <w:r>
+              <w:rPr>
+                <w:b/>
+                <w:bCs/>
+                <w:sz w:val="20"/>
+                <w:szCs w:val="20"/>
+              </w:rPr>
+              <w:t xml:space="preserve">−40 %</w:t>
+            </w:r>
+          </w:p>
+        </w:tc>
+        <w:tc>
+          <w:tcPr>
+            <w:tcW w:type="dxa" w:w="1200"/>
+            <w:tcBorders>
+              <w:top w:val="single" w:color="C8CFD6" w:sz="4"/>
+              <w:left w:val="single" w:color="C8CFD6" w:sz="4"/>
+              <w:bottom w:val="single" w:color="C8CFD6" w:sz="4"/>
+              <w:right w:val="single" w:color="C8CFD6" w:sz="4"/>
+            </w:tcBorders>
+            <w:tcMar>
+              <w:top w:type="dxa" w:w="80"/>
+              <w:left w:type="dxa" w:w="120"/>
+              <w:bottom w:type="dxa" w:w="80"/>
+              <w:right w:type="dxa" w:w="120"/>
+            </w:tcMar>
+          </w:tcPr>
+          <w:p>
+            <w:pPr>
+              <w:jc w:val="center"/>
+            </w:pPr>
+            <w:r>
+              <w:rPr>
+                <w:b w:val="false"/>
+                <w:bCs w:val="false"/>
+                <w:sz w:val="20"/>
+                <w:szCs w:val="20"/>
+              </w:rPr>
+              <w:t xml:space="preserve">3.0</w:t>
+            </w:r>
+          </w:p>
+        </w:tc>
+      </w:tr>
+      <w:tr>
+        <w:trPr>
+          <w:cantSplit/>
+        </w:trPr>
+        <w:tc>
+          <w:tcPr>
+            <w:tcW w:type="dxa" w:w="3200"/>
+            <w:tcBorders>
+              <w:top w:val="single" w:color="C8CFD6" w:sz="4"/>
+              <w:left w:val="single" w:color="C8CFD6" w:sz="4"/>
+              <w:bottom w:val="single" w:color="C8CFD6" w:sz="4"/>
+              <w:right w:val="single" w:color="C8CFD6" w:sz="4"/>
+            </w:tcBorders>
+            <w:tcMar>
+              <w:top w:type="dxa" w:w="80"/>
+              <w:left w:type="dxa" w:w="120"/>
+              <w:bottom w:type="dxa" w:w="80"/>
+              <w:right w:type="dxa" w:w="120"/>
+            </w:tcMar>
+          </w:tcPr>
+          <w:p>
+            <w:pPr>
+              <w:jc w:val="left"/>
+            </w:pPr>
+            <w:r>
+              <w:rPr>
+                <w:b w:val="false"/>
+                <w:bCs w:val="false"/>
+                <w:sz w:val="20"/>
+                <w:szCs w:val="20"/>
+              </w:rPr>
+              <w:t xml:space="preserve">Base adiabat at breakout</w:t>
+            </w:r>
+          </w:p>
+        </w:tc>
+        <w:tc>
+          <w:tcPr>
+            <w:tcW w:type="dxa" w:w="1700"/>
+            <w:tcBorders>
+              <w:top w:val="single" w:color="C8CFD6" w:sz="4"/>
+              <w:left w:val="single" w:color="C8CFD6" w:sz="4"/>
+              <w:bottom w:val="single" w:color="C8CFD6" w:sz="4"/>
+              <w:right w:val="single" w:color="C8CFD6" w:sz="4"/>
+            </w:tcBorders>
+            <w:tcMar>
+              <w:top w:type="dxa" w:w="80"/>
+              <w:left w:type="dxa" w:w="120"/>
+              <w:bottom w:type="dxa" w:w="80"/>
+              <w:right w:type="dxa" w:w="120"/>
+            </w:tcMar>
+          </w:tcPr>
+          <w:p>
+            <w:pPr>
+              <w:jc w:val="center"/>
+            </w:pPr>
+            <w:r>
+              <w:rPr>
+                <w:b w:val="false"/>
+                <w:bCs w:val="false"/>
+                <w:sz w:val="20"/>
+                <w:szCs w:val="20"/>
+              </w:rPr>
+              <w:t xml:space="preserve">0.39</w:t>
+            </w:r>
+          </w:p>
+        </w:tc>
+        <w:tc>
+          <w:tcPr>
+            <w:tcW w:type="dxa" w:w="1700"/>
+            <w:tcBorders>
+              <w:top w:val="single" w:color="C8CFD6" w:sz="4"/>
+              <w:left w:val="single" w:color="C8CFD6" w:sz="4"/>
+              <w:bottom w:val="single" w:color="C8CFD6" w:sz="4"/>
+              <w:right w:val="single" w:color="C8CFD6" w:sz="4"/>
+            </w:tcBorders>
+            <w:tcMar>
+              <w:top w:type="dxa" w:w="80"/>
+              <w:left w:type="dxa" w:w="120"/>
+              <w:bottom w:type="dxa" w:w="80"/>
+              <w:right w:type="dxa" w:w="120"/>
+            </w:tcMar>
+          </w:tcPr>
+          <w:p>
+            <w:pPr>
+              <w:jc w:val="center"/>
+            </w:pPr>
+            <w:r>
+              <w:rPr>
+                <w:b w:val="false"/>
+                <w:bCs w:val="false"/>
+                <w:sz w:val="20"/>
+                <w:szCs w:val="20"/>
+              </w:rPr>
+              <w:t xml:space="preserve">0.39</w:t>
+            </w:r>
+          </w:p>
+        </w:tc>
+        <w:tc>
+          <w:tcPr>
+            <w:tcW w:type="dxa" w:w="1300"/>
+            <w:tcBorders>
+              <w:top w:val="single" w:color="C8CFD6" w:sz="4"/>
+              <w:left w:val="single" w:color="C8CFD6" w:sz="4"/>
+              <w:bottom w:val="single" w:color="C8CFD6" w:sz="4"/>
+              <w:right w:val="single" w:color="C8CFD6" w:sz="4"/>
+            </w:tcBorders>
+            <w:tcMar>
+              <w:top w:type="dxa" w:w="80"/>
+              <w:left w:type="dxa" w:w="120"/>
+              <w:bottom w:type="dxa" w:w="80"/>
+              <w:right w:type="dxa" w:w="120"/>
+            </w:tcMar>
+          </w:tcPr>
+          <w:p>
+            <w:pPr>
+              <w:jc w:val="center"/>
+            </w:pPr>
+            <w:r>
+              <w:rPr>
+                <w:b/>
+                <w:bCs/>
+                <w:sz w:val="20"/>
+                <w:szCs w:val="20"/>
+              </w:rPr>
+              <w:t xml:space="preserve">0 %</w:t>
+            </w:r>
+          </w:p>
+        </w:tc>
+        <w:tc>
+          <w:tcPr>
+            <w:tcW w:type="dxa" w:w="1200"/>
+            <w:tcBorders>
+              <w:top w:val="single" w:color="C8CFD6" w:sz="4"/>
+              <w:left w:val="single" w:color="C8CFD6" w:sz="4"/>
+              <w:bottom w:val="single" w:color="C8CFD6" w:sz="4"/>
+              <w:right w:val="single" w:color="C8CFD6" w:sz="4"/>
+            </w:tcBorders>
+            <w:tcMar>
+              <w:top w:type="dxa" w:w="80"/>
+              <w:left w:type="dxa" w:w="120"/>
+              <w:bottom w:type="dxa" w:w="80"/>
+              <w:right w:type="dxa" w:w="120"/>
+            </w:tcMar>
+          </w:tcPr>
+          <w:p>
+            <w:pPr>
+              <w:jc w:val="center"/>
+            </w:pPr>
+            <w:r>
+              <w:rPr>
+                <w:b w:val="false"/>
+                <w:bCs w:val="false"/>
+                <w:sz w:val="20"/>
+                <w:szCs w:val="20"/>
+              </w:rPr>
+              <w:t xml:space="preserve">—</w:t>
+            </w:r>
+          </w:p>
+        </w:tc>
+      </w:tr>
+      <w:tr>
+        <w:trPr>
+          <w:cantSplit/>
+        </w:trPr>
+        <w:tc>
+          <w:tcPr>
+            <w:tcW w:type="dxa" w:w="3200"/>
+            <w:tcBorders>
+              <w:top w:val="single" w:color="C8CFD6" w:sz="4"/>
+              <w:left w:val="single" w:color="C8CFD6" w:sz="4"/>
+              <w:bottom w:val="single" w:color="C8CFD6" w:sz="4"/>
+              <w:right w:val="single" w:color="C8CFD6" w:sz="4"/>
+            </w:tcBorders>
+            <w:tcMar>
+              <w:top w:type="dxa" w:w="80"/>
+              <w:left w:type="dxa" w:w="120"/>
+              <w:bottom w:type="dxa" w:w="80"/>
+              <w:right w:type="dxa" w:w="120"/>
+            </w:tcMar>
+          </w:tcPr>
+          <w:p>
+            <w:pPr>
+              <w:jc w:val="left"/>
+            </w:pPr>
+            <w:r>
+              <w:rPr>
+                <w:b w:val="false"/>
+                <w:bCs w:val="false"/>
+                <w:sz w:val="20"/>
+                <w:szCs w:val="20"/>
+              </w:rPr>
+              <w:t xml:space="preserve">⟨ρR_cf⟩ (g/cm²)</w:t>
+            </w:r>
+          </w:p>
+        </w:tc>
+        <w:tc>
+          <w:tcPr>
+            <w:tcW w:type="dxa" w:w="1700"/>
+            <w:tcBorders>
+              <w:top w:val="single" w:color="C8CFD6" w:sz="4"/>
+              <w:left w:val="single" w:color="C8CFD6" w:sz="4"/>
+              <w:bottom w:val="single" w:color="C8CFD6" w:sz="4"/>
+              <w:right w:val="single" w:color="C8CFD6" w:sz="4"/>
+            </w:tcBorders>
+            <w:tcMar>
+              <w:top w:type="dxa" w:w="80"/>
+              <w:left w:type="dxa" w:w="120"/>
+              <w:bottom w:type="dxa" w:w="80"/>
+              <w:right w:type="dxa" w:w="120"/>
+            </w:tcMar>
+          </w:tcPr>
+          <w:p>
+            <w:pPr>
+              <w:jc w:val="center"/>
+            </w:pPr>
+            <w:r>
+              <w:rPr>
+                <w:b w:val="false"/>
+                <w:bCs w:val="false"/>
+                <w:sz w:val="20"/>
+                <w:szCs w:val="20"/>
+              </w:rPr>
+              <w:t xml:space="preserve">0.96</w:t>
+            </w:r>
+          </w:p>
+        </w:tc>
+        <w:tc>
+          <w:tcPr>
+            <w:tcW w:type="dxa" w:w="1700"/>
+            <w:tcBorders>
+              <w:top w:val="single" w:color="C8CFD6" w:sz="4"/>
+              <w:left w:val="single" w:color="C8CFD6" w:sz="4"/>
+              <w:bottom w:val="single" w:color="C8CFD6" w:sz="4"/>
+              <w:right w:val="single" w:color="C8CFD6" w:sz="4"/>
+            </w:tcBorders>
+            <w:tcMar>
+              <w:top w:type="dxa" w:w="80"/>
+              <w:left w:type="dxa" w:w="120"/>
+              <w:bottom w:type="dxa" w:w="80"/>
+              <w:right w:type="dxa" w:w="120"/>
+            </w:tcMar>
+          </w:tcPr>
+          <w:p>
+            <w:pPr>
+              <w:jc w:val="center"/>
+            </w:pPr>
+            <w:r>
+              <w:rPr>
+                <w:b w:val="false"/>
+                <w:bCs w:val="false"/>
+                <w:sz w:val="20"/>
+                <w:szCs w:val="20"/>
+              </w:rPr>
+              <w:t xml:space="preserve">0.76</w:t>
+            </w:r>
+          </w:p>
+        </w:tc>
+        <w:tc>
+          <w:tcPr>
+            <w:tcW w:type="dxa" w:w="1300"/>
+            <w:tcBorders>
+              <w:top w:val="single" w:color="C8CFD6" w:sz="4"/>
+              <w:left w:val="single" w:color="C8CFD6" w:sz="4"/>
+              <w:bottom w:val="single" w:color="C8CFD6" w:sz="4"/>
+              <w:right w:val="single" w:color="C8CFD6" w:sz="4"/>
+            </w:tcBorders>
+            <w:tcMar>
+              <w:top w:type="dxa" w:w="80"/>
+              <w:left w:type="dxa" w:w="120"/>
+              <w:bottom w:type="dxa" w:w="80"/>
+              <w:right w:type="dxa" w:w="120"/>
+            </w:tcMar>
+          </w:tcPr>
+          <w:p>
+            <w:pPr>
+              <w:jc w:val="center"/>
+            </w:pPr>
+            <w:r>
+              <w:rPr>
+                <w:b w:val="false"/>
+                <w:bCs w:val="false"/>
+                <w:sz w:val="20"/>
+                <w:szCs w:val="20"/>
+              </w:rPr>
+              <w:t xml:space="preserve">−21 %</w:t>
+            </w:r>
+          </w:p>
+        </w:tc>
+        <w:tc>
+          <w:tcPr>
+            <w:tcW w:type="dxa" w:w="1200"/>
+            <w:tcBorders>
+              <w:top w:val="single" w:color="C8CFD6" w:sz="4"/>
+              <w:left w:val="single" w:color="C8CFD6" w:sz="4"/>
+              <w:bottom w:val="single" w:color="C8CFD6" w:sz="4"/>
+              <w:right w:val="single" w:color="C8CFD6" w:sz="4"/>
+            </w:tcBorders>
+            <w:tcMar>
+              <w:top w:type="dxa" w:w="80"/>
+              <w:left w:type="dxa" w:w="120"/>
+              <w:bottom w:type="dxa" w:w="80"/>
+              <w:right w:type="dxa" w:w="120"/>
+            </w:tcMar>
+          </w:tcPr>
+          <w:p>
+            <w:pPr>
+              <w:jc w:val="center"/>
+            </w:pPr>
+            <w:r>
+              <w:rPr>
+                <w:b w:val="false"/>
+                <w:bCs w:val="false"/>
+                <w:sz w:val="20"/>
+                <w:szCs w:val="20"/>
+              </w:rPr>
+              <w:t xml:space="preserve">1.10</w:t>
+            </w:r>
+          </w:p>
+        </w:tc>
+      </w:tr>
+      <w:tr>
+        <w:trPr>
+          <w:cantSplit/>
+        </w:trPr>
+        <w:tc>
+          <w:tcPr>
+            <w:tcW w:type="dxa" w:w="3200"/>
+            <w:tcBorders>
+              <w:top w:val="single" w:color="C8CFD6" w:sz="4"/>
+              <w:left w:val="single" w:color="C8CFD6" w:sz="4"/>
+              <w:bottom w:val="single" w:color="C8CFD6" w:sz="4"/>
+              <w:right w:val="single" w:color="C8CFD6" w:sz="4"/>
+            </w:tcBorders>
+            <w:tcMar>
+              <w:top w:type="dxa" w:w="80"/>
+              <w:left w:type="dxa" w:w="120"/>
+              <w:bottom w:type="dxa" w:w="80"/>
+              <w:right w:type="dxa" w:w="120"/>
+            </w:tcMar>
+          </w:tcPr>
+          <w:p>
+            <w:pPr>
+              <w:jc w:val="left"/>
+            </w:pPr>
+            <w:r>
+              <w:rPr>
+                <w:b w:val="false"/>
+                <w:bCs w:val="false"/>
+                <w:sz w:val="20"/>
+                <w:szCs w:val="20"/>
+              </w:rPr>
+              <w:t xml:space="preserve">⟨P_hs⟩ (Gbar)</w:t>
+            </w:r>
+          </w:p>
+        </w:tc>
+        <w:tc>
+          <w:tcPr>
+            <w:tcW w:type="dxa" w:w="1700"/>
+            <w:tcBorders>
+              <w:top w:val="single" w:color="C8CFD6" w:sz="4"/>
+              <w:left w:val="single" w:color="C8CFD6" w:sz="4"/>
+              <w:bottom w:val="single" w:color="C8CFD6" w:sz="4"/>
+              <w:right w:val="single" w:color="C8CFD6" w:sz="4"/>
+            </w:tcBorders>
+            <w:tcMar>
+              <w:top w:type="dxa" w:w="80"/>
+              <w:left w:type="dxa" w:w="120"/>
+              <w:bottom w:type="dxa" w:w="80"/>
+              <w:right w:type="dxa" w:w="120"/>
+            </w:tcMar>
+          </w:tcPr>
+          <w:p>
+            <w:pPr>
+              <w:jc w:val="center"/>
+            </w:pPr>
+            <w:r>
+              <w:rPr>
+                <w:b w:val="false"/>
+                <w:bCs w:val="false"/>
+                <w:sz w:val="20"/>
+                <w:szCs w:val="20"/>
+              </w:rPr>
+              <w:t xml:space="preserve">90.6</w:t>
+            </w:r>
+          </w:p>
+        </w:tc>
+        <w:tc>
+          <w:tcPr>
+            <w:tcW w:type="dxa" w:w="1700"/>
+            <w:tcBorders>
+              <w:top w:val="single" w:color="C8CFD6" w:sz="4"/>
+              <w:left w:val="single" w:color="C8CFD6" w:sz="4"/>
+              <w:bottom w:val="single" w:color="C8CFD6" w:sz="4"/>
+              <w:right w:val="single" w:color="C8CFD6" w:sz="4"/>
+            </w:tcBorders>
+            <w:tcMar>
+              <w:top w:type="dxa" w:w="80"/>
+              <w:left w:type="dxa" w:w="120"/>
+              <w:bottom w:type="dxa" w:w="80"/>
+              <w:right w:type="dxa" w:w="120"/>
+            </w:tcMar>
+          </w:tcPr>
+          <w:p>
+            <w:pPr>
+              <w:jc w:val="center"/>
+            </w:pPr>
+            <w:r>
+              <w:rPr>
+                <w:b w:val="false"/>
+                <w:bCs w:val="false"/>
+                <w:sz w:val="20"/>
+                <w:szCs w:val="20"/>
+              </w:rPr>
+              <w:t xml:space="preserve">56.3</w:t>
+            </w:r>
+          </w:p>
+        </w:tc>
+        <w:tc>
+          <w:tcPr>
+            <w:tcW w:type="dxa" w:w="1300"/>
+            <w:tcBorders>
+              <w:top w:val="single" w:color="C8CFD6" w:sz="4"/>
+              <w:left w:val="single" w:color="C8CFD6" w:sz="4"/>
+              <w:bottom w:val="single" w:color="C8CFD6" w:sz="4"/>
+              <w:right w:val="single" w:color="C8CFD6" w:sz="4"/>
+            </w:tcBorders>
+            <w:tcMar>
+              <w:top w:type="dxa" w:w="80"/>
+              <w:left w:type="dxa" w:w="120"/>
+              <w:bottom w:type="dxa" w:w="80"/>
+              <w:right w:type="dxa" w:w="120"/>
+            </w:tcMar>
+          </w:tcPr>
+          <w:p>
+            <w:pPr>
+              <w:jc w:val="center"/>
+            </w:pPr>
+            <w:r>
+              <w:rPr>
+                <w:b w:val="false"/>
+                <w:bCs w:val="false"/>
+                <w:sz w:val="20"/>
+                <w:szCs w:val="20"/>
+              </w:rPr>
+              <w:t xml:space="preserve">−38 %</w:t>
+            </w:r>
+          </w:p>
+        </w:tc>
+        <w:tc>
+          <w:tcPr>
+            <w:tcW w:type="dxa" w:w="1200"/>
+            <w:tcBorders>
+              <w:top w:val="single" w:color="C8CFD6" w:sz="4"/>
+              <w:left w:val="single" w:color="C8CFD6" w:sz="4"/>
+              <w:bottom w:val="single" w:color="C8CFD6" w:sz="4"/>
+              <w:right w:val="single" w:color="C8CFD6" w:sz="4"/>
+            </w:tcBorders>
+            <w:tcMar>
+              <w:top w:type="dxa" w:w="80"/>
+              <w:left w:type="dxa" w:w="120"/>
+              <w:bottom w:type="dxa" w:w="80"/>
+              <w:right w:type="dxa" w:w="120"/>
+            </w:tcMar>
+          </w:tcPr>
+          <w:p>
+            <w:pPr>
+              <w:jc w:val="center"/>
+            </w:pPr>
+            <w:r>
+              <w:rPr>
+                <w:b w:val="false"/>
+                <w:bCs w:val="false"/>
+                <w:sz w:val="20"/>
+                <w:szCs w:val="20"/>
+              </w:rPr>
+              <w:t xml:space="preserve">193</w:t>
+            </w:r>
+          </w:p>
+        </w:tc>
+      </w:tr>
+      <w:tr>
+        <w:trPr>
+          <w:cantSplit/>
+        </w:trPr>
+        <w:tc>
+          <w:tcPr>
+            <w:tcW w:type="dxa" w:w="3200"/>
+            <w:tcBorders>
+              <w:top w:val="single" w:color="C8CFD6" w:sz="4"/>
+              <w:left w:val="single" w:color="C8CFD6" w:sz="4"/>
+              <w:bottom w:val="single" w:color="C8CFD6" w:sz="4"/>
+              <w:right w:val="single" w:color="C8CFD6" w:sz="4"/>
+            </w:tcBorders>
+            <w:tcMar>
+              <w:top w:type="dxa" w:w="80"/>
+              <w:left w:type="dxa" w:w="120"/>
+              <w:bottom w:type="dxa" w:w="80"/>
+              <w:right w:type="dxa" w:w="120"/>
+            </w:tcMar>
+          </w:tcPr>
+          <w:p>
+            <w:pPr>
+              <w:jc w:val="left"/>
+            </w:pPr>
+            <w:r>
+              <w:rPr>
+                <w:b w:val="false"/>
+                <w:bCs w:val="false"/>
+                <w:sz w:val="20"/>
+                <w:szCs w:val="20"/>
+              </w:rPr>
+              <w:t xml:space="preserve">CR_max</w:t>
+            </w:r>
+          </w:p>
+        </w:tc>
+        <w:tc>
+          <w:tcPr>
+            <w:tcW w:type="dxa" w:w="1700"/>
+            <w:tcBorders>
+              <w:top w:val="single" w:color="C8CFD6" w:sz="4"/>
+              <w:left w:val="single" w:color="C8CFD6" w:sz="4"/>
+              <w:bottom w:val="single" w:color="C8CFD6" w:sz="4"/>
+              <w:right w:val="single" w:color="C8CFD6" w:sz="4"/>
+            </w:tcBorders>
+            <w:tcMar>
+              <w:top w:type="dxa" w:w="80"/>
+              <w:left w:type="dxa" w:w="120"/>
+              <w:bottom w:type="dxa" w:w="80"/>
+              <w:right w:type="dxa" w:w="120"/>
+            </w:tcMar>
+          </w:tcPr>
+          <w:p>
+            <w:pPr>
+              <w:jc w:val="center"/>
+            </w:pPr>
+            <w:r>
+              <w:rPr>
+                <w:b w:val="false"/>
+                <w:bCs w:val="false"/>
+                <w:sz w:val="20"/>
+                <w:szCs w:val="20"/>
+              </w:rPr>
+              <w:t xml:space="preserve">38.3</w:t>
+            </w:r>
+          </w:p>
+        </w:tc>
+        <w:tc>
+          <w:tcPr>
+            <w:tcW w:type="dxa" w:w="1700"/>
+            <w:tcBorders>
+              <w:top w:val="single" w:color="C8CFD6" w:sz="4"/>
+              <w:left w:val="single" w:color="C8CFD6" w:sz="4"/>
+              <w:bottom w:val="single" w:color="C8CFD6" w:sz="4"/>
+              <w:right w:val="single" w:color="C8CFD6" w:sz="4"/>
+            </w:tcBorders>
+            <w:tcMar>
+              <w:top w:type="dxa" w:w="80"/>
+              <w:left w:type="dxa" w:w="120"/>
+              <w:bottom w:type="dxa" w:w="80"/>
+              <w:right w:type="dxa" w:w="120"/>
+            </w:tcMar>
+          </w:tcPr>
+          <w:p>
+            <w:pPr>
+              <w:jc w:val="center"/>
+            </w:pPr>
+            <w:r>
+              <w:rPr>
+                <w:b w:val="false"/>
+                <w:bCs w:val="false"/>
+                <w:sz w:val="20"/>
+                <w:szCs w:val="20"/>
+              </w:rPr>
+              <w:t xml:space="preserve">33.4</w:t>
+            </w:r>
+          </w:p>
+        </w:tc>
+        <w:tc>
+          <w:tcPr>
+            <w:tcW w:type="dxa" w:w="1300"/>
+            <w:tcBorders>
+              <w:top w:val="single" w:color="C8CFD6" w:sz="4"/>
+              <w:left w:val="single" w:color="C8CFD6" w:sz="4"/>
+              <w:bottom w:val="single" w:color="C8CFD6" w:sz="4"/>
+              <w:right w:val="single" w:color="C8CFD6" w:sz="4"/>
+            </w:tcBorders>
+            <w:tcMar>
+              <w:top w:type="dxa" w:w="80"/>
+              <w:left w:type="dxa" w:w="120"/>
+              <w:bottom w:type="dxa" w:w="80"/>
+              <w:right w:type="dxa" w:w="120"/>
+            </w:tcMar>
+          </w:tcPr>
+          <w:p>
+            <w:pPr>
+              <w:jc w:val="center"/>
+            </w:pPr>
+            <w:r>
+              <w:rPr>
+                <w:b w:val="false"/>
+                <w:bCs w:val="false"/>
+                <w:sz w:val="20"/>
+                <w:szCs w:val="20"/>
+              </w:rPr>
+              <w:t xml:space="preserve">−13 %</w:t>
+            </w:r>
+          </w:p>
+        </w:tc>
+        <w:tc>
+          <w:tcPr>
+            <w:tcW w:type="dxa" w:w="1200"/>
+            <w:tcBorders>
+              <w:top w:val="single" w:color="C8CFD6" w:sz="4"/>
+              <w:left w:val="single" w:color="C8CFD6" w:sz="4"/>
+              <w:bottom w:val="single" w:color="C8CFD6" w:sz="4"/>
+              <w:right w:val="single" w:color="C8CFD6" w:sz="4"/>
+            </w:tcBorders>
+            <w:tcMar>
+              <w:top w:type="dxa" w:w="80"/>
+              <w:left w:type="dxa" w:w="120"/>
+              <w:bottom w:type="dxa" w:w="80"/>
+              <w:right w:type="dxa" w:w="120"/>
+            </w:tcMar>
+          </w:tcPr>
+          <w:p>
+            <w:pPr>
+              <w:jc w:val="center"/>
+            </w:pPr>
+            <w:r>
+              <w:rPr>
+                <w:b w:val="false"/>
+                <w:bCs w:val="false"/>
+                <w:sz w:val="20"/>
+                <w:szCs w:val="20"/>
+              </w:rPr>
+              <w:t xml:space="preserve">29 ± 3</w:t>
+            </w:r>
+          </w:p>
+        </w:tc>
+      </w:tr>
+      <w:tr>
+        <w:trPr>
+          <w:cantSplit/>
+        </w:trPr>
+        <w:tc>
+          <w:tcPr>
+            <w:tcW w:type="dxa" w:w="3200"/>
+            <w:tcBorders>
+              <w:top w:val="single" w:color="C8CFD6" w:sz="4"/>
+              <w:left w:val="single" w:color="C8CFD6" w:sz="4"/>
+              <w:bottom w:val="single" w:color="C8CFD6" w:sz="4"/>
+              <w:right w:val="single" w:color="C8CFD6" w:sz="4"/>
+            </w:tcBorders>
+            <w:tcMar>
+              <w:top w:type="dxa" w:w="80"/>
+              <w:left w:type="dxa" w:w="120"/>
+              <w:bottom w:type="dxa" w:w="80"/>
+              <w:right w:type="dxa" w:w="120"/>
+            </w:tcMar>
+          </w:tcPr>
+          <w:p>
+            <w:pPr>
+              <w:jc w:val="left"/>
+            </w:pPr>
+            <w:r>
+              <w:rPr>
+                <w:b w:val="false"/>
+                <w:bCs w:val="false"/>
+                <w:sz w:val="20"/>
+                <w:szCs w:val="20"/>
+              </w:rPr>
+              <w:t xml:space="preserve">Imploded DT mass (mg)</w:t>
+            </w:r>
+          </w:p>
+        </w:tc>
+        <w:tc>
+          <w:tcPr>
+            <w:tcW w:type="dxa" w:w="1700"/>
+            <w:tcBorders>
+              <w:top w:val="single" w:color="C8CFD6" w:sz="4"/>
+              <w:left w:val="single" w:color="C8CFD6" w:sz="4"/>
+              <w:bottom w:val="single" w:color="C8CFD6" w:sz="4"/>
+              <w:right w:val="single" w:color="C8CFD6" w:sz="4"/>
+            </w:tcBorders>
+            <w:tcMar>
+              <w:top w:type="dxa" w:w="80"/>
+              <w:left w:type="dxa" w:w="120"/>
+              <w:bottom w:type="dxa" w:w="80"/>
+              <w:right w:type="dxa" w:w="120"/>
+            </w:tcMar>
+          </w:tcPr>
+          <w:p>
+            <w:pPr>
+              <w:jc w:val="center"/>
+            </w:pPr>
+            <w:r>
+              <w:rPr>
+                <w:b w:val="false"/>
+                <w:bCs w:val="false"/>
+                <w:sz w:val="20"/>
+                <w:szCs w:val="20"/>
+              </w:rPr>
+              <w:t xml:space="preserve">0.60</w:t>
+            </w:r>
+          </w:p>
+        </w:tc>
+        <w:tc>
+          <w:tcPr>
+            <w:tcW w:type="dxa" w:w="1700"/>
+            <w:tcBorders>
+              <w:top w:val="single" w:color="C8CFD6" w:sz="4"/>
+              <w:left w:val="single" w:color="C8CFD6" w:sz="4"/>
+              <w:bottom w:val="single" w:color="C8CFD6" w:sz="4"/>
+              <w:right w:val="single" w:color="C8CFD6" w:sz="4"/>
+            </w:tcBorders>
+            <w:tcMar>
+              <w:top w:type="dxa" w:w="80"/>
+              <w:left w:type="dxa" w:w="120"/>
+              <w:bottom w:type="dxa" w:w="80"/>
+              <w:right w:type="dxa" w:w="120"/>
+            </w:tcMar>
+          </w:tcPr>
+          <w:p>
+            <w:pPr>
+              <w:jc w:val="center"/>
+            </w:pPr>
+            <w:r>
+              <w:rPr>
+                <w:b w:val="false"/>
+                <w:bCs w:val="false"/>
+                <w:sz w:val="20"/>
+                <w:szCs w:val="20"/>
+              </w:rPr>
+              <w:t xml:space="preserve">0.60</w:t>
+            </w:r>
+          </w:p>
+        </w:tc>
+        <w:tc>
+          <w:tcPr>
+            <w:tcW w:type="dxa" w:w="1300"/>
+            <w:tcBorders>
+              <w:top w:val="single" w:color="C8CFD6" w:sz="4"/>
+              <w:left w:val="single" w:color="C8CFD6" w:sz="4"/>
+              <w:bottom w:val="single" w:color="C8CFD6" w:sz="4"/>
+              <w:right w:val="single" w:color="C8CFD6" w:sz="4"/>
+            </w:tcBorders>
+            <w:tcMar>
+              <w:top w:type="dxa" w:w="80"/>
+              <w:left w:type="dxa" w:w="120"/>
+              <w:bottom w:type="dxa" w:w="80"/>
+              <w:right w:type="dxa" w:w="120"/>
+            </w:tcMar>
+          </w:tcPr>
+          <w:p>
+            <w:pPr>
+              <w:jc w:val="center"/>
+            </w:pPr>
+            <w:r>
+              <w:rPr>
+                <w:b/>
+                <w:bCs/>
+                <w:sz w:val="20"/>
+                <w:szCs w:val="20"/>
+              </w:rPr>
+              <w:t xml:space="preserve">0 %</w:t>
+            </w:r>
+          </w:p>
+        </w:tc>
+        <w:tc>
+          <w:tcPr>
+            <w:tcW w:type="dxa" w:w="1200"/>
+            <w:tcBorders>
+              <w:top w:val="single" w:color="C8CFD6" w:sz="4"/>
+              <w:left w:val="single" w:color="C8CFD6" w:sz="4"/>
+              <w:bottom w:val="single" w:color="C8CFD6" w:sz="4"/>
+              <w:right w:val="single" w:color="C8CFD6" w:sz="4"/>
+            </w:tcBorders>
+            <w:tcMar>
+              <w:top w:type="dxa" w:w="80"/>
+              <w:left w:type="dxa" w:w="120"/>
+              <w:bottom w:type="dxa" w:w="80"/>
+              <w:right w:type="dxa" w:w="120"/>
+            </w:tcMar>
+          </w:tcPr>
+          <w:p>
+            <w:pPr>
+              <w:jc w:val="center"/>
+            </w:pPr>
+            <w:r>
+              <w:rPr>
+                <w:b w:val="false"/>
+                <w:bCs w:val="false"/>
+                <w:sz w:val="20"/>
+                <w:szCs w:val="20"/>
+              </w:rPr>
+              <w:t xml:space="preserve">~3.0</w:t>
+            </w:r>
+          </w:p>
+        </w:tc>
+      </w:tr>
+      <w:tr>
+        <w:trPr>
+          <w:cantSplit/>
+        </w:trPr>
+        <w:tc>
+          <w:tcPr>
+            <w:tcW w:type="dxa" w:w="3200"/>
+            <w:tcBorders>
+              <w:top w:val="single" w:color="C8CFD6" w:sz="4"/>
+              <w:left w:val="single" w:color="C8CFD6" w:sz="4"/>
+              <w:bottom w:val="single" w:color="C8CFD6" w:sz="4"/>
+              <w:right w:val="single" w:color="C8CFD6" w:sz="4"/>
+            </w:tcBorders>
+            <w:tcMar>
+              <w:top w:type="dxa" w:w="80"/>
+              <w:left w:type="dxa" w:w="120"/>
+              <w:bottom w:type="dxa" w:w="80"/>
+              <w:right w:type="dxa" w:w="120"/>
+            </w:tcMar>
+          </w:tcPr>
+          <w:p>
+            <w:pPr>
+              <w:jc w:val="left"/>
+            </w:pPr>
+            <w:r>
+              <w:rPr>
+                <w:b w:val="false"/>
+                <w:bCs w:val="false"/>
+                <w:sz w:val="20"/>
+                <w:szCs w:val="20"/>
+              </w:rPr>
+              <w:t xml:space="preserve">Yield (MJ, no-burn)</w:t>
+            </w:r>
+          </w:p>
+        </w:tc>
+        <w:tc>
+          <w:tcPr>
+            <w:tcW w:type="dxa" w:w="1700"/>
+            <w:tcBorders>
+              <w:top w:val="single" w:color="C8CFD6" w:sz="4"/>
+              <w:left w:val="single" w:color="C8CFD6" w:sz="4"/>
+              <w:bottom w:val="single" w:color="C8CFD6" w:sz="4"/>
+              <w:right w:val="single" w:color="C8CFD6" w:sz="4"/>
+            </w:tcBorders>
+            <w:tcMar>
+              <w:top w:type="dxa" w:w="80"/>
+              <w:left w:type="dxa" w:w="120"/>
+              <w:bottom w:type="dxa" w:w="80"/>
+              <w:right w:type="dxa" w:w="120"/>
+            </w:tcMar>
+          </w:tcPr>
+          <w:p>
+            <w:pPr>
+              <w:jc w:val="center"/>
+            </w:pPr>
+            <w:r>
+              <w:rPr>
+                <w:b w:val="false"/>
+                <w:bCs w:val="false"/>
+                <w:sz w:val="20"/>
+                <w:szCs w:val="20"/>
+              </w:rPr>
+              <w:t xml:space="preserve">0.316</w:t>
+            </w:r>
+          </w:p>
+        </w:tc>
+        <w:tc>
+          <w:tcPr>
+            <w:tcW w:type="dxa" w:w="1700"/>
+            <w:tcBorders>
+              <w:top w:val="single" w:color="C8CFD6" w:sz="4"/>
+              <w:left w:val="single" w:color="C8CFD6" w:sz="4"/>
+              <w:bottom w:val="single" w:color="C8CFD6" w:sz="4"/>
+              <w:right w:val="single" w:color="C8CFD6" w:sz="4"/>
+            </w:tcBorders>
+            <w:tcMar>
+              <w:top w:type="dxa" w:w="80"/>
+              <w:left w:type="dxa" w:w="120"/>
+              <w:bottom w:type="dxa" w:w="80"/>
+              <w:right w:type="dxa" w:w="120"/>
+            </w:tcMar>
+          </w:tcPr>
+          <w:p>
+            <w:pPr>
+              <w:jc w:val="center"/>
+            </w:pPr>
+            <w:r>
+              <w:rPr>
+                <w:b w:val="false"/>
+                <w:bCs w:val="false"/>
+                <w:sz w:val="20"/>
+                <w:szCs w:val="20"/>
+              </w:rPr>
+              <w:t xml:space="preserve">0.170</w:t>
+            </w:r>
+          </w:p>
+        </w:tc>
+        <w:tc>
+          <w:tcPr>
+            <w:tcW w:type="dxa" w:w="1300"/>
+            <w:tcBorders>
+              <w:top w:val="single" w:color="C8CFD6" w:sz="4"/>
+              <w:left w:val="single" w:color="C8CFD6" w:sz="4"/>
+              <w:bottom w:val="single" w:color="C8CFD6" w:sz="4"/>
+              <w:right w:val="single" w:color="C8CFD6" w:sz="4"/>
+            </w:tcBorders>
+            <w:tcMar>
+              <w:top w:type="dxa" w:w="80"/>
+              <w:left w:type="dxa" w:w="120"/>
+              <w:bottom w:type="dxa" w:w="80"/>
+              <w:right w:type="dxa" w:w="120"/>
+            </w:tcMar>
+          </w:tcPr>
+          <w:p>
+            <w:pPr>
+              <w:jc w:val="center"/>
+            </w:pPr>
+            <w:r>
+              <w:rPr>
+                <w:b w:val="false"/>
+                <w:bCs w:val="false"/>
+                <w:sz w:val="20"/>
+                <w:szCs w:val="20"/>
+              </w:rPr>
+              <w:t xml:space="preserve">−46 %</w:t>
+            </w:r>
+          </w:p>
+        </w:tc>
+        <w:tc>
+          <w:tcPr>
+            <w:tcW w:type="dxa" w:w="1200"/>
+            <w:tcBorders>
+              <w:top w:val="single" w:color="C8CFD6" w:sz="4"/>
+              <w:left w:val="single" w:color="C8CFD6" w:sz="4"/>
+              <w:bottom w:val="single" w:color="C8CFD6" w:sz="4"/>
+              <w:right w:val="single" w:color="C8CFD6" w:sz="4"/>
+            </w:tcBorders>
+            <w:tcMar>
+              <w:top w:type="dxa" w:w="80"/>
+              <w:left w:type="dxa" w:w="120"/>
+              <w:bottom w:type="dxa" w:w="80"/>
+              <w:right w:type="dxa" w:w="120"/>
+            </w:tcMar>
+          </w:tcPr>
+          <w:p>
+            <w:pPr>
+              <w:jc w:val="center"/>
+            </w:pPr>
+            <w:r>
+              <w:rPr>
+                <w:b w:val="false"/>
+                <w:bCs w:val="false"/>
+                <w:sz w:val="20"/>
+                <w:szCs w:val="20"/>
+              </w:rPr>
+              <w:t xml:space="preserve">—</w:t>
+            </w:r>
+          </w:p>
+        </w:tc>
+      </w:tr>
+    </w:tbl>
     <w:p>
       <w:pPr>
         <w:spacing w:after="120" w:before="0" w:line="280"/>
@@ -2345,7 +4294,7 @@
           <w:sz w:val="22"/>
           <w:szCs w:val="22"/>
         </w:rPr>
-        <w:t xml:space="preserve">For HDD lrm4, with cone θ = 1° and the same focal distance, the miss threshold falls to d·sin(1°) = 38 µm.  The ablation surface only crosses below 38 µm at deep stagnation, by which point the laser is no longer firing.  The 1D ray-trace miss is therefore expected to be essentially zero for the HDD geometry as currently configured; this prediction will be confirmed by a parallel pre-processor run, but the geometric argument is robust.</w:t>
+        <w:t xml:space="preserve"/>
       </w:r>
     </w:p>
     <w:p>
@@ -2361,35 +4310,24 @@
           <w:sz w:val="22"/>
           <w:szCs w:val="22"/>
         </w:rPr>
-        <w:t xml:space="preserve">Disposition. </w:t>
-      </w:r>
-      <w:r>
-        <w:rPr>
-          <w:b w:val="false"/>
-          <w:bCs w:val="false"/>
-          <w:i w:val="false"/>
-          <w:iCs w:val="false"/>
-          <w:sz w:val="22"/>
-          <w:szCs w:val="22"/>
-        </w:rPr>
-        <w:t xml:space="preserve">The 1D ray-trace limitation is real but small for PDD and negligible for HDD lrm4.  The Helios calibration residuals — adiabat shortfall, HS ρR shortfall, yield gap — survive this correction with little change, indicating that the binding constraint is elsewhere in the assembly physics (most likely the compression-deficit chain: shell-fuel mass distribution at stagnation, EOS, and/or drive-symmetry effects not captured in 1D).</w:t>
+        <w:t xml:space="preserve">Validation. </w:t>
+      </w:r>
+      <w:r>
+        <w:rPr>
+          <w:b w:val="false"/>
+          <w:bCs w:val="false"/>
+          <w:i w:val="false"/>
+          <w:iCs w:val="false"/>
+          <w:sz w:val="22"/>
+          <w:szCs w:val="22"/>
+        </w:rPr>
+        <w:t xml:space="preserve">The pre-processor predicted a −14.9 % reduction in delivered energy from the rhw pulse-table integral; Helios delivered −12.3 %.  The 2.6 pp slippage is the second-order shift in Helios's spot–sphere coupling factor (79.6 → 82.0 %), arising because the slightly less violent implosion keeps the target larger longer and so captures more of the Gaussian spatial profile.  After accounting for this, the prediction and the Helios result agree to within numerical integration precision.</w:t>
       </w:r>
     </w:p>
     <w:p>
       <w:pPr>
         <w:spacing w:after="120" w:before="0" w:line="280"/>
       </w:pPr>
-      <w:r>
-        <w:rPr>
-          <w:b w:val="false"/>
-          <w:bCs w:val="false"/>
-          <w:i w:val="false"/>
-          <w:iCs w:val="false"/>
-          <w:sz w:val="22"/>
-          <w:szCs w:val="22"/>
-        </w:rPr>
-        <w:t xml:space="preserve">On this basis, </w:t>
-      </w:r>
       <w:r>
         <w:rPr>
           <w:b/>
@@ -2399,6 +4337,154 @@
           <w:sz w:val="22"/>
           <w:szCs w:val="22"/>
         </w:rPr>
+        <w:t xml:space="preserve">What moves and what does not. </w:t>
+      </w:r>
+      <w:r>
+        <w:rPr>
+          <w:b w:val="false"/>
+          <w:bCs w:val="false"/>
+          <w:i w:val="false"/>
+          <w:iCs w:val="false"/>
+          <w:sz w:val="22"/>
+          <w:szCs w:val="22"/>
+        </w:rPr>
+        <w:t xml:space="preserve">Three observations from the comparison table sharpen the physical picture:</w:t>
+      </w:r>
+    </w:p>
+    <w:p>
+      <w:pPr>
+        <w:pStyle w:val="ListParagraph"/>
+        <w:numPr>
+          <w:ilvl w:val="0"/>
+          <w:numId w:val="2"/>
+        </w:numPr>
+        <w:spacing w:after="80" w:line="280"/>
+      </w:pPr>
+      <w:r>
+        <w:rPr>
+          <w:sz w:val="22"/>
+          <w:szCs w:val="22"/>
+        </w:rPr>
+        <w:t xml:space="preserve">Foot-pulse-set metrics are unchanged.  Base adiabat at breakout (0.39 → 0.39, exactly) and imploded DT mass (0.60 mg → 0.60 mg, exactly) are set during the foot pulse where f_geom = 1, and are therefore structurally outside the correction's reach.</w:t>
+      </w:r>
+    </w:p>
+    <w:p>
+      <w:pPr>
+        <w:pStyle w:val="ListParagraph"/>
+        <w:numPr>
+          <w:ilvl w:val="0"/>
+          <w:numId w:val="2"/>
+        </w:numPr>
+        <w:spacing w:after="80" w:line="280"/>
+      </w:pPr>
+      <w:r>
+        <w:rPr>
+          <w:sz w:val="22"/>
+          <w:szCs w:val="22"/>
+        </w:rPr>
+        <w:t xml:space="preserve">Peak velocity barely moves (−1.6 %), confirming the structural argument from §6.1: with f_geom = 1.000 at peak laser power, the rocket-equation work integral against the imploding shell is essentially unchanged.  The 1.6 % residual comes from reduced late-tail coasting drive.</w:t>
+      </w:r>
+    </w:p>
+    <w:p>
+      <w:pPr>
+        <w:pStyle w:val="ListParagraph"/>
+        <w:numPr>
+          <w:ilvl w:val="0"/>
+          <w:numId w:val="2"/>
+        </w:numPr>
+        <w:spacing w:after="80" w:line="280"/>
+      </w:pPr>
+      <w:r>
+        <w:rPr>
+          <w:sz w:val="22"/>
+          <w:szCs w:val="22"/>
+        </w:rPr>
+        <w:t xml:space="preserve">The compression channel absorbs the full energy reduction.  ⟨P_hs⟩ falls 38 %, ⟨ρR_cf⟩ 21 %, yield 46 %, peak density 25 %.  Mass-averaged adiabat falls 40 % (1.79 → 1.07) — moving the wrong way relative to cluster's 3.0 — because the correction reduces late-pulse re-heating of the assembling cold fuel, leaving it softer and less compressed than baseline.</w:t>
+      </w:r>
+    </w:p>
+    <w:p>
+      <w:pPr>
+        <w:pStyle w:val="Heading2"/>
+        <w:spacing w:after="120" w:before="220"/>
+      </w:pPr>
+      <w:r>
+        <w:rPr>
+          <w:b/>
+          <w:bCs/>
+          <w:color w:val="1A2841"/>
+          <w:sz w:val="24"/>
+          <w:szCs w:val="24"/>
+        </w:rPr>
+        <w:t xml:space="preserve">6.3 Disposition</w:t>
+      </w:r>
+    </w:p>
+    <w:p>
+      <w:pPr>
+        <w:spacing w:after="120" w:before="0" w:line="280"/>
+      </w:pPr>
+      <w:r>
+        <w:rPr>
+          <w:b w:val="false"/>
+          <w:bCs w:val="false"/>
+          <w:i w:val="false"/>
+          <w:iCs w:val="false"/>
+          <w:sz w:val="22"/>
+          <w:szCs w:val="22"/>
+        </w:rPr>
+        <w:t xml:space="preserve">The 1D ray-trace correction is real and quantitatively predictable.  Applied to a wide-cone PDD anchor, it brings delivered laser energy onto the cluster reference value (1.452 MJ vs cluster 1.40 MJ).  But </w:t>
+      </w:r>
+      <w:r>
+        <w:rPr>
+          <w:b/>
+          <w:bCs/>
+          <w:i w:val="false"/>
+          <w:iCs w:val="false"/>
+          <w:sz w:val="22"/>
+          <w:szCs w:val="22"/>
+        </w:rPr>
+        <w:t xml:space="preserve">the binding calibration residuals — adiabat shortfall, ρR_cf shortfall, imploded-mass shortfall, yield gap — survive the correction unchanged or move in the wrong direction. </w:t>
+      </w:r>
+      <w:r>
+        <w:rPr>
+          <w:b w:val="false"/>
+          <w:bCs w:val="false"/>
+          <w:i w:val="false"/>
+          <w:iCs w:val="false"/>
+          <w:sz w:val="22"/>
+          <w:szCs w:val="22"/>
+        </w:rPr>
+        <w:t xml:space="preserve">The 1D ray-trace is not the limiting physics for matching the 3D-code cluster.  The compression-deficit chain — shell-fuel mass distribution at stagnation, EOS, drive-symmetry effects not captured in 1D — remains the binding constraint.</w:t>
+      </w:r>
+    </w:p>
+    <w:p>
+      <w:pPr>
+        <w:spacing w:after="120" w:before="0" w:line="280"/>
+      </w:pPr>
+      <w:r>
+        <w:rPr>
+          <w:b w:val="false"/>
+          <w:bCs w:val="false"/>
+          <w:i w:val="false"/>
+          <w:iCs w:val="false"/>
+          <w:sz w:val="22"/>
+          <w:szCs w:val="22"/>
+        </w:rPr>
+        <w:t xml:space="preserve">Anchor-selection bias is now empirically resolved as well. The natural concern ("the calibration anchor was selected without the correction in the loop, biasing the selection toward geometries where the correction is small") was addressed by running the correction on a wide-cone anchor where the geometric miss is six times larger than at the primary PDD_20 anchor.  The corrected wide-cone result does not unlock a better cluster match; it just shifts which subset of metrics agree with cluster.  Re-running the calibration scan with the correction applied in the loop would shift the chosen anchor but would not close the compression residuals — the gap is in the assembly physics, not the delivery physics.</w:t>
+      </w:r>
+    </w:p>
+    <w:p>
+      <w:pPr>
+        <w:spacing w:after="120" w:before="0" w:line="280"/>
+      </w:pPr>
+      <w:r>
+        <w:rPr>
+          <w:b/>
+          <w:bCs/>
+          <w:i w:val="false"/>
+          <w:iCs w:val="false"/>
+          <w:sz w:val="22"/>
+          <w:szCs w:val="22"/>
+        </w:rPr>
         <w:t xml:space="preserve">Options 2 and 3 (in-Helios source-code modifications) are not pursued.</w:t>
       </w:r>
       <w:r>
@@ -2410,7 +4496,7 @@
           <w:sz w:val="22"/>
           <w:szCs w:val="22"/>
         </w:rPr>
-        <w:t xml:space="preserve">  The pre-processor is retained as a diagnostic for future targets where the geometric miss could be larger — wider cones, shorter focal distances, or more aggressive implosions that compress the ablation surface below the miss threshold earlier in the pulse.  Should such a target enter the calibration scope, the empirical Option 1 test can be re-run in minutes and a new disposition reached.</w:t>
+        <w:t xml:space="preserve">  The Option 1 pre-processor is retained as a diagnostic for future targets where the geometric miss could be larger than tested here — wider cones, shorter focal distances, or more aggressive implosions that compress the ablation surface below the miss threshold earlier in the pulse.  The pre-processor / rhw patcher / Helios round-trip pipeline is functional end-to-end and can be re-run in minutes on a new candidate geometry.</w:t>
       </w:r>
     </w:p>
     <w:p>

</xml_diff>